<commit_message>
Add project review PDF; set organisation on report covers
- 09_build_project_review_pdf.py: development process, tech stack,
  challenges and solutions, enhancements, performance (measured step
  timings), scalability and efficiency, with timing and architecture charts
- Report covers: internship organisation "Yuva"; supervisor line removed
  (all weekly documents and the integrated report)
- run_pipeline.py now runs steps 01-09
- Outputs refreshed by a full pipeline run in the project folder
  (identical results; new timestamps and float rounding only)

Co-Authored-By: Claude Opus 5.5 <noreply@anthropic.com>
</commit_message>
<xml_diff>
--- a/report/weekly/Week1_Strategic_Plan.docx
+++ b/report/weekly/Week1_Strategic_Plan.docx
@@ -89,22 +89,7 @@
         <w:t xml:space="preserve">Internship organisation: </w:t>
       </w:r>
       <w:r>
-        <w:t>[Organisation name]</w:t>
-      </w:r>
-    </w:p>
-    <w:p>
-      <w:pPr>
-        <w:spacing w:after="40"/>
-        <w:jc w:val="center"/>
-      </w:pPr>
-      <w:r>
-        <w:rPr>
-          <w:b/>
-        </w:rPr>
-        <w:t xml:space="preserve">Supervisor: </w:t>
-      </w:r>
-      <w:r>
-        <w:t>[Supervisor name]</w:t>
+        <w:t>Yuva</w:t>
       </w:r>
     </w:p>
     <w:p>
@@ -179,7 +164,7 @@
       <w:r>
         <w:fldChar w:fldCharType="separate"/>
       </w:r>
-      <w:hyperlink w:anchor="_Toc243733092" w:history="1">
+      <w:hyperlink w:anchor="_Toc243758688" w:history="1">
         <w:r>
           <w:rPr>
             <w:rStyle w:val="Hyperlink"/>
@@ -206,7 +191,7 @@
             <w:noProof/>
             <w:webHidden/>
           </w:rPr>
-          <w:instrText xml:space="preserve"> PAGEREF _Toc243733092 \h </w:instrText>
+          <w:instrText xml:space="preserve"> PAGEREF _Toc243758688 \h </w:instrText>
         </w:r>
         <w:r>
           <w:rPr>
@@ -254,7 +239,7 @@
           <w14:ligatures w14:val="standardContextual"/>
         </w:rPr>
       </w:pPr>
-      <w:hyperlink w:anchor="_Toc243733093" w:history="1">
+      <w:hyperlink w:anchor="_Toc243758689" w:history="1">
         <w:r>
           <w:rPr>
             <w:rStyle w:val="Hyperlink"/>
@@ -281,7 +266,7 @@
             <w:noProof/>
             <w:webHidden/>
           </w:rPr>
-          <w:instrText xml:space="preserve"> PAGEREF _Toc243733093 \h </w:instrText>
+          <w:instrText xml:space="preserve"> PAGEREF _Toc243758689 \h </w:instrText>
         </w:r>
         <w:r>
           <w:rPr>
@@ -329,7 +314,7 @@
           <w14:ligatures w14:val="standardContextual"/>
         </w:rPr>
       </w:pPr>
-      <w:hyperlink w:anchor="_Toc243733094" w:history="1">
+      <w:hyperlink w:anchor="_Toc243758690" w:history="1">
         <w:r>
           <w:rPr>
             <w:rStyle w:val="Hyperlink"/>
@@ -356,7 +341,7 @@
             <w:noProof/>
             <w:webHidden/>
           </w:rPr>
-          <w:instrText xml:space="preserve"> PAGEREF _Toc243733094 \h </w:instrText>
+          <w:instrText xml:space="preserve"> PAGEREF _Toc243758690 \h </w:instrText>
         </w:r>
         <w:r>
           <w:rPr>
@@ -404,7 +389,7 @@
           <w14:ligatures w14:val="standardContextual"/>
         </w:rPr>
       </w:pPr>
-      <w:hyperlink w:anchor="_Toc243733095" w:history="1">
+      <w:hyperlink w:anchor="_Toc243758691" w:history="1">
         <w:r>
           <w:rPr>
             <w:rStyle w:val="Hyperlink"/>
@@ -431,7 +416,7 @@
             <w:noProof/>
             <w:webHidden/>
           </w:rPr>
-          <w:instrText xml:space="preserve"> PAGEREF _Toc243733095 \h </w:instrText>
+          <w:instrText xml:space="preserve"> PAGEREF _Toc243758691 \h </w:instrText>
         </w:r>
         <w:r>
           <w:rPr>
@@ -479,7 +464,7 @@
           <w14:ligatures w14:val="standardContextual"/>
         </w:rPr>
       </w:pPr>
-      <w:hyperlink w:anchor="_Toc243733096" w:history="1">
+      <w:hyperlink w:anchor="_Toc243758692" w:history="1">
         <w:r>
           <w:rPr>
             <w:rStyle w:val="Hyperlink"/>
@@ -506,7 +491,7 @@
             <w:noProof/>
             <w:webHidden/>
           </w:rPr>
-          <w:instrText xml:space="preserve"> PAGEREF _Toc243733096 \h </w:instrText>
+          <w:instrText xml:space="preserve"> PAGEREF _Toc243758692 \h </w:instrText>
         </w:r>
         <w:r>
           <w:rPr>
@@ -554,7 +539,7 @@
           <w14:ligatures w14:val="standardContextual"/>
         </w:rPr>
       </w:pPr>
-      <w:hyperlink w:anchor="_Toc243733097" w:history="1">
+      <w:hyperlink w:anchor="_Toc243758693" w:history="1">
         <w:r>
           <w:rPr>
             <w:rStyle w:val="Hyperlink"/>
@@ -581,7 +566,7 @@
             <w:noProof/>
             <w:webHidden/>
           </w:rPr>
-          <w:instrText xml:space="preserve"> PAGEREF _Toc243733097 \h </w:instrText>
+          <w:instrText xml:space="preserve"> PAGEREF _Toc243758693 \h </w:instrText>
         </w:r>
         <w:r>
           <w:rPr>
@@ -629,7 +614,7 @@
           <w14:ligatures w14:val="standardContextual"/>
         </w:rPr>
       </w:pPr>
-      <w:hyperlink w:anchor="_Toc243733098" w:history="1">
+      <w:hyperlink w:anchor="_Toc243758694" w:history="1">
         <w:r>
           <w:rPr>
             <w:rStyle w:val="Hyperlink"/>
@@ -656,7 +641,7 @@
             <w:noProof/>
             <w:webHidden/>
           </w:rPr>
-          <w:instrText xml:space="preserve"> PAGEREF _Toc243733098 \h </w:instrText>
+          <w:instrText xml:space="preserve"> PAGEREF _Toc243758694 \h </w:instrText>
         </w:r>
         <w:r>
           <w:rPr>
@@ -704,7 +689,7 @@
           <w14:ligatures w14:val="standardContextual"/>
         </w:rPr>
       </w:pPr>
-      <w:hyperlink w:anchor="_Toc243733099" w:history="1">
+      <w:hyperlink w:anchor="_Toc243758695" w:history="1">
         <w:r>
           <w:rPr>
             <w:rStyle w:val="Hyperlink"/>
@@ -731,7 +716,7 @@
             <w:noProof/>
             <w:webHidden/>
           </w:rPr>
-          <w:instrText xml:space="preserve"> PAGEREF _Toc243733099 \h </w:instrText>
+          <w:instrText xml:space="preserve"> PAGEREF _Toc243758695 \h </w:instrText>
         </w:r>
         <w:r>
           <w:rPr>
@@ -779,7 +764,7 @@
           <w14:ligatures w14:val="standardContextual"/>
         </w:rPr>
       </w:pPr>
-      <w:hyperlink w:anchor="_Toc243733100" w:history="1">
+      <w:hyperlink w:anchor="_Toc243758696" w:history="1">
         <w:r>
           <w:rPr>
             <w:rStyle w:val="Hyperlink"/>
@@ -806,7 +791,7 @@
             <w:noProof/>
             <w:webHidden/>
           </w:rPr>
-          <w:instrText xml:space="preserve"> PAGEREF _Toc243733100 \h </w:instrText>
+          <w:instrText xml:space="preserve"> PAGEREF _Toc243758696 \h </w:instrText>
         </w:r>
         <w:r>
           <w:rPr>
@@ -854,7 +839,7 @@
           <w14:ligatures w14:val="standardContextual"/>
         </w:rPr>
       </w:pPr>
-      <w:hyperlink w:anchor="_Toc243733101" w:history="1">
+      <w:hyperlink w:anchor="_Toc243758697" w:history="1">
         <w:r>
           <w:rPr>
             <w:rStyle w:val="Hyperlink"/>
@@ -881,7 +866,7 @@
             <w:noProof/>
             <w:webHidden/>
           </w:rPr>
-          <w:instrText xml:space="preserve"> PAGEREF _Toc243733101 \h </w:instrText>
+          <w:instrText xml:space="preserve"> PAGEREF _Toc243758697 \h </w:instrText>
         </w:r>
         <w:r>
           <w:rPr>
@@ -929,7 +914,7 @@
           <w14:ligatures w14:val="standardContextual"/>
         </w:rPr>
       </w:pPr>
-      <w:hyperlink w:anchor="_Toc243733102" w:history="1">
+      <w:hyperlink w:anchor="_Toc243758698" w:history="1">
         <w:r>
           <w:rPr>
             <w:rStyle w:val="Hyperlink"/>
@@ -956,7 +941,7 @@
             <w:noProof/>
             <w:webHidden/>
           </w:rPr>
-          <w:instrText xml:space="preserve"> PAGEREF _Toc243733102 \h </w:instrText>
+          <w:instrText xml:space="preserve"> PAGEREF _Toc243758698 \h </w:instrText>
         </w:r>
         <w:r>
           <w:rPr>
@@ -1004,7 +989,7 @@
           <w14:ligatures w14:val="standardContextual"/>
         </w:rPr>
       </w:pPr>
-      <w:hyperlink w:anchor="_Toc243733103" w:history="1">
+      <w:hyperlink w:anchor="_Toc243758699" w:history="1">
         <w:r>
           <w:rPr>
             <w:rStyle w:val="Hyperlink"/>
@@ -1031,7 +1016,7 @@
             <w:noProof/>
             <w:webHidden/>
           </w:rPr>
-          <w:instrText xml:space="preserve"> PAGEREF _Toc243733103 \h </w:instrText>
+          <w:instrText xml:space="preserve"> PAGEREF _Toc243758699 \h </w:instrText>
         </w:r>
         <w:r>
           <w:rPr>
@@ -1079,7 +1064,7 @@
           <w14:ligatures w14:val="standardContextual"/>
         </w:rPr>
       </w:pPr>
-      <w:hyperlink w:anchor="_Toc243733104" w:history="1">
+      <w:hyperlink w:anchor="_Toc243758700" w:history="1">
         <w:r>
           <w:rPr>
             <w:rStyle w:val="Hyperlink"/>
@@ -1106,7 +1091,7 @@
             <w:noProof/>
             <w:webHidden/>
           </w:rPr>
-          <w:instrText xml:space="preserve"> PAGEREF _Toc243733104 \h </w:instrText>
+          <w:instrText xml:space="preserve"> PAGEREF _Toc243758700 \h </w:instrText>
         </w:r>
         <w:r>
           <w:rPr>
@@ -1154,7 +1139,7 @@
           <w14:ligatures w14:val="standardContextual"/>
         </w:rPr>
       </w:pPr>
-      <w:hyperlink w:anchor="_Toc243733105" w:history="1">
+      <w:hyperlink w:anchor="_Toc243758701" w:history="1">
         <w:r>
           <w:rPr>
             <w:rStyle w:val="Hyperlink"/>
@@ -1181,7 +1166,7 @@
             <w:noProof/>
             <w:webHidden/>
           </w:rPr>
-          <w:instrText xml:space="preserve"> PAGEREF _Toc243733105 \h </w:instrText>
+          <w:instrText xml:space="preserve"> PAGEREF _Toc243758701 \h </w:instrText>
         </w:r>
         <w:r>
           <w:rPr>
@@ -1229,7 +1214,7 @@
           <w14:ligatures w14:val="standardContextual"/>
         </w:rPr>
       </w:pPr>
-      <w:hyperlink w:anchor="_Toc243733106" w:history="1">
+      <w:hyperlink w:anchor="_Toc243758702" w:history="1">
         <w:r>
           <w:rPr>
             <w:rStyle w:val="Hyperlink"/>
@@ -1256,7 +1241,7 @@
             <w:noProof/>
             <w:webHidden/>
           </w:rPr>
-          <w:instrText xml:space="preserve"> PAGEREF _Toc243733106 \h </w:instrText>
+          <w:instrText xml:space="preserve"> PAGEREF _Toc243758702 \h </w:instrText>
         </w:r>
         <w:r>
           <w:rPr>
@@ -1304,7 +1289,7 @@
           <w14:ligatures w14:val="standardContextual"/>
         </w:rPr>
       </w:pPr>
-      <w:hyperlink w:anchor="_Toc243733107" w:history="1">
+      <w:hyperlink w:anchor="_Toc243758703" w:history="1">
         <w:r>
           <w:rPr>
             <w:rStyle w:val="Hyperlink"/>
@@ -1331,7 +1316,7 @@
             <w:noProof/>
             <w:webHidden/>
           </w:rPr>
-          <w:instrText xml:space="preserve"> PAGEREF _Toc243733107 \h </w:instrText>
+          <w:instrText xml:space="preserve"> PAGEREF _Toc243758703 \h </w:instrText>
         </w:r>
         <w:r>
           <w:rPr>
@@ -1379,7 +1364,7 @@
           <w14:ligatures w14:val="standardContextual"/>
         </w:rPr>
       </w:pPr>
-      <w:hyperlink w:anchor="_Toc243733108" w:history="1">
+      <w:hyperlink w:anchor="_Toc243758704" w:history="1">
         <w:r>
           <w:rPr>
             <w:rStyle w:val="Hyperlink"/>
@@ -1406,7 +1391,7 @@
             <w:noProof/>
             <w:webHidden/>
           </w:rPr>
-          <w:instrText xml:space="preserve"> PAGEREF _Toc243733108 \h </w:instrText>
+          <w:instrText xml:space="preserve"> PAGEREF _Toc243758704 \h </w:instrText>
         </w:r>
         <w:r>
           <w:rPr>
@@ -1454,7 +1439,7 @@
           <w14:ligatures w14:val="standardContextual"/>
         </w:rPr>
       </w:pPr>
-      <w:hyperlink w:anchor="_Toc243733109" w:history="1">
+      <w:hyperlink w:anchor="_Toc243758705" w:history="1">
         <w:r>
           <w:rPr>
             <w:rStyle w:val="Hyperlink"/>
@@ -1481,7 +1466,7 @@
             <w:noProof/>
             <w:webHidden/>
           </w:rPr>
-          <w:instrText xml:space="preserve"> PAGEREF _Toc243733109 \h </w:instrText>
+          <w:instrText xml:space="preserve"> PAGEREF _Toc243758705 \h </w:instrText>
         </w:r>
         <w:r>
           <w:rPr>
@@ -1529,7 +1514,7 @@
           <w14:ligatures w14:val="standardContextual"/>
         </w:rPr>
       </w:pPr>
-      <w:hyperlink w:anchor="_Toc243733110" w:history="1">
+      <w:hyperlink w:anchor="_Toc243758706" w:history="1">
         <w:r>
           <w:rPr>
             <w:rStyle w:val="Hyperlink"/>
@@ -1556,7 +1541,7 @@
             <w:noProof/>
             <w:webHidden/>
           </w:rPr>
-          <w:instrText xml:space="preserve"> PAGEREF _Toc243733110 \h </w:instrText>
+          <w:instrText xml:space="preserve"> PAGEREF _Toc243758706 \h </w:instrText>
         </w:r>
         <w:r>
           <w:rPr>
@@ -1604,7 +1589,7 @@
           <w14:ligatures w14:val="standardContextual"/>
         </w:rPr>
       </w:pPr>
-      <w:hyperlink w:anchor="_Toc243733111" w:history="1">
+      <w:hyperlink w:anchor="_Toc243758707" w:history="1">
         <w:r>
           <w:rPr>
             <w:rStyle w:val="Hyperlink"/>
@@ -1631,7 +1616,7 @@
             <w:noProof/>
             <w:webHidden/>
           </w:rPr>
-          <w:instrText xml:space="preserve"> PAGEREF _Toc243733111 \h </w:instrText>
+          <w:instrText xml:space="preserve"> PAGEREF _Toc243758707 \h </w:instrText>
         </w:r>
         <w:r>
           <w:rPr>
@@ -1679,7 +1664,7 @@
           <w14:ligatures w14:val="standardContextual"/>
         </w:rPr>
       </w:pPr>
-      <w:hyperlink w:anchor="_Toc243733112" w:history="1">
+      <w:hyperlink w:anchor="_Toc243758708" w:history="1">
         <w:r>
           <w:rPr>
             <w:rStyle w:val="Hyperlink"/>
@@ -1706,7 +1691,7 @@
             <w:noProof/>
             <w:webHidden/>
           </w:rPr>
-          <w:instrText xml:space="preserve"> PAGEREF _Toc243733112 \h </w:instrText>
+          <w:instrText xml:space="preserve"> PAGEREF _Toc243758708 \h </w:instrText>
         </w:r>
         <w:r>
           <w:rPr>
@@ -1754,7 +1739,7 @@
           <w14:ligatures w14:val="standardContextual"/>
         </w:rPr>
       </w:pPr>
-      <w:hyperlink w:anchor="_Toc243733113" w:history="1">
+      <w:hyperlink w:anchor="_Toc243758709" w:history="1">
         <w:r>
           <w:rPr>
             <w:rStyle w:val="Hyperlink"/>
@@ -1781,7 +1766,7 @@
             <w:noProof/>
             <w:webHidden/>
           </w:rPr>
-          <w:instrText xml:space="preserve"> PAGEREF _Toc243733113 \h </w:instrText>
+          <w:instrText xml:space="preserve"> PAGEREF _Toc243758709 \h </w:instrText>
         </w:r>
         <w:r>
           <w:rPr>
@@ -1829,7 +1814,7 @@
           <w14:ligatures w14:val="standardContextual"/>
         </w:rPr>
       </w:pPr>
-      <w:hyperlink w:anchor="_Toc243733114" w:history="1">
+      <w:hyperlink w:anchor="_Toc243758710" w:history="1">
         <w:r>
           <w:rPr>
             <w:rStyle w:val="Hyperlink"/>
@@ -1856,7 +1841,7 @@
             <w:noProof/>
             <w:webHidden/>
           </w:rPr>
-          <w:instrText xml:space="preserve"> PAGEREF _Toc243733114 \h </w:instrText>
+          <w:instrText xml:space="preserve"> PAGEREF _Toc243758710 \h </w:instrText>
         </w:r>
         <w:r>
           <w:rPr>
@@ -1904,7 +1889,7 @@
           <w14:ligatures w14:val="standardContextual"/>
         </w:rPr>
       </w:pPr>
-      <w:hyperlink w:anchor="_Toc243733115" w:history="1">
+      <w:hyperlink w:anchor="_Toc243758711" w:history="1">
         <w:r>
           <w:rPr>
             <w:rStyle w:val="Hyperlink"/>
@@ -1931,7 +1916,7 @@
             <w:noProof/>
             <w:webHidden/>
           </w:rPr>
-          <w:instrText xml:space="preserve"> PAGEREF _Toc243733115 \h </w:instrText>
+          <w:instrText xml:space="preserve"> PAGEREF _Toc243758711 \h </w:instrText>
         </w:r>
         <w:r>
           <w:rPr>
@@ -1979,7 +1964,7 @@
           <w14:ligatures w14:val="standardContextual"/>
         </w:rPr>
       </w:pPr>
-      <w:hyperlink w:anchor="_Toc243733116" w:history="1">
+      <w:hyperlink w:anchor="_Toc243758712" w:history="1">
         <w:r>
           <w:rPr>
             <w:rStyle w:val="Hyperlink"/>
@@ -2006,7 +1991,7 @@
             <w:noProof/>
             <w:webHidden/>
           </w:rPr>
-          <w:instrText xml:space="preserve"> PAGEREF _Toc243733116 \h </w:instrText>
+          <w:instrText xml:space="preserve"> PAGEREF _Toc243758712 \h </w:instrText>
         </w:r>
         <w:r>
           <w:rPr>
@@ -2054,7 +2039,7 @@
           <w14:ligatures w14:val="standardContextual"/>
         </w:rPr>
       </w:pPr>
-      <w:hyperlink w:anchor="_Toc243733117" w:history="1">
+      <w:hyperlink w:anchor="_Toc243758713" w:history="1">
         <w:r>
           <w:rPr>
             <w:rStyle w:val="Hyperlink"/>
@@ -2081,7 +2066,7 @@
             <w:noProof/>
             <w:webHidden/>
           </w:rPr>
-          <w:instrText xml:space="preserve"> PAGEREF _Toc243733117 \h </w:instrText>
+          <w:instrText xml:space="preserve"> PAGEREF _Toc243758713 \h </w:instrText>
         </w:r>
         <w:r>
           <w:rPr>
@@ -2129,7 +2114,7 @@
           <w14:ligatures w14:val="standardContextual"/>
         </w:rPr>
       </w:pPr>
-      <w:hyperlink w:anchor="_Toc243733118" w:history="1">
+      <w:hyperlink w:anchor="_Toc243758714" w:history="1">
         <w:r>
           <w:rPr>
             <w:rStyle w:val="Hyperlink"/>
@@ -2156,7 +2141,7 @@
             <w:noProof/>
             <w:webHidden/>
           </w:rPr>
-          <w:instrText xml:space="preserve"> PAGEREF _Toc243733118 \h </w:instrText>
+          <w:instrText xml:space="preserve"> PAGEREF _Toc243758714 \h </w:instrText>
         </w:r>
         <w:r>
           <w:rPr>
@@ -2204,7 +2189,7 @@
           <w14:ligatures w14:val="standardContextual"/>
         </w:rPr>
       </w:pPr>
-      <w:hyperlink w:anchor="_Toc243733119" w:history="1">
+      <w:hyperlink w:anchor="_Toc243758715" w:history="1">
         <w:r>
           <w:rPr>
             <w:rStyle w:val="Hyperlink"/>
@@ -2231,7 +2216,7 @@
             <w:noProof/>
             <w:webHidden/>
           </w:rPr>
-          <w:instrText xml:space="preserve"> PAGEREF _Toc243733119 \h </w:instrText>
+          <w:instrText xml:space="preserve"> PAGEREF _Toc243758715 \h </w:instrText>
         </w:r>
         <w:r>
           <w:rPr>
@@ -2279,7 +2264,7 @@
           <w14:ligatures w14:val="standardContextual"/>
         </w:rPr>
       </w:pPr>
-      <w:hyperlink w:anchor="_Toc243733120" w:history="1">
+      <w:hyperlink w:anchor="_Toc243758716" w:history="1">
         <w:r>
           <w:rPr>
             <w:rStyle w:val="Hyperlink"/>
@@ -2306,7 +2291,7 @@
             <w:noProof/>
             <w:webHidden/>
           </w:rPr>
-          <w:instrText xml:space="preserve"> PAGEREF _Toc243733120 \h </w:instrText>
+          <w:instrText xml:space="preserve"> PAGEREF _Toc243758716 \h </w:instrText>
         </w:r>
         <w:r>
           <w:rPr>
@@ -2365,7 +2350,7 @@
       <w:pPr>
         <w:pStyle w:val="Heading1"/>
       </w:pPr>
-      <w:bookmarkStart w:id="0" w:name="_Toc243733092"/>
+      <w:bookmarkStart w:id="0" w:name="_Toc243758688"/>
       <w:r>
         <w:t>1. Executive Summary</w:t>
       </w:r>
@@ -2488,7 +2473,7 @@
       <w:pPr>
         <w:pStyle w:val="Heading1"/>
       </w:pPr>
-      <w:bookmarkStart w:id="1" w:name="_Toc243733093"/>
+      <w:bookmarkStart w:id="1" w:name="_Toc243758689"/>
       <w:r>
         <w:lastRenderedPageBreak/>
         <w:t>2. The Role of Strategic Planning in Healthcare Data Analysis</w:t>
@@ -2580,7 +2565,7 @@
           <w:noProof/>
         </w:rPr>
         <w:drawing>
-          <wp:inline distT="0" distB="0" distL="0" distR="0" wp14:anchorId="487F2DE5" wp14:editId="52108C59">
+          <wp:inline distT="0" distB="0" distL="0" distR="0" wp14:anchorId="6CE8D044" wp14:editId="3A8ABE36">
             <wp:extent cx="5903999" cy="1862677"/>
             <wp:effectExtent l="0" t="0" r="0" b="0"/>
             <wp:docPr id="1" name="Picture 1"/>
@@ -2668,7 +2653,7 @@
       <w:pPr>
         <w:pStyle w:val="Heading1"/>
       </w:pPr>
-      <w:bookmarkStart w:id="2" w:name="_Toc243733094"/>
+      <w:bookmarkStart w:id="2" w:name="_Toc243758690"/>
       <w:r>
         <w:lastRenderedPageBreak/>
         <w:t>3. Problem Statement and Business Case</w:t>
@@ -2984,7 +2969,7 @@
       <w:pPr>
         <w:pStyle w:val="Heading1"/>
       </w:pPr>
-      <w:bookmarkStart w:id="3" w:name="_Toc243733095"/>
+      <w:bookmarkStart w:id="3" w:name="_Toc243758691"/>
       <w:r>
         <w:lastRenderedPageBreak/>
         <w:t>4. Project Scope</w:t>
@@ -3287,7 +3272,7 @@
       <w:pPr>
         <w:pStyle w:val="Heading2"/>
       </w:pPr>
-      <w:bookmarkStart w:id="4" w:name="_Toc243733096"/>
+      <w:bookmarkStart w:id="4" w:name="_Toc243758692"/>
       <w:r>
         <w:t>4.1 Objectives (SMART)</w:t>
       </w:r>
@@ -3935,7 +3920,7 @@
       <w:pPr>
         <w:pStyle w:val="Heading2"/>
       </w:pPr>
-      <w:bookmarkStart w:id="5" w:name="_Toc243733097"/>
+      <w:bookmarkStart w:id="5" w:name="_Toc243758693"/>
       <w:r>
         <w:t>4.2 Key questions and hypotheses</w:t>
       </w:r>
@@ -4453,7 +4438,7 @@
       <w:pPr>
         <w:pStyle w:val="Heading1"/>
       </w:pPr>
-      <w:bookmarkStart w:id="6" w:name="_Toc243733098"/>
+      <w:bookmarkStart w:id="6" w:name="_Toc243758694"/>
       <w:r>
         <w:lastRenderedPageBreak/>
         <w:t>5. Stakeholders and Governance</w:t>
@@ -5175,7 +5160,7 @@
       <w:pPr>
         <w:pStyle w:val="Heading2"/>
       </w:pPr>
-      <w:bookmarkStart w:id="7" w:name="_Toc243733099"/>
+      <w:bookmarkStart w:id="7" w:name="_Toc243758695"/>
       <w:r>
         <w:t>5.1 Responsibilities (RACI)</w:t>
       </w:r>
@@ -6093,7 +6078,7 @@
       <w:pPr>
         <w:pStyle w:val="Heading2"/>
       </w:pPr>
-      <w:bookmarkStart w:id="8" w:name="_Toc243733100"/>
+      <w:bookmarkStart w:id="8" w:name="_Toc243758696"/>
       <w:r>
         <w:t>5.2 Governance procedures</w:t>
       </w:r>
@@ -6148,7 +6133,7 @@
       <w:pPr>
         <w:pStyle w:val="Heading1"/>
       </w:pPr>
-      <w:bookmarkStart w:id="9" w:name="_Toc243733101"/>
+      <w:bookmarkStart w:id="9" w:name="_Toc243758697"/>
       <w:r>
         <w:lastRenderedPageBreak/>
         <w:t>6. Data Strategy</w:t>
@@ -6175,7 +6160,7 @@
       <w:pPr>
         <w:pStyle w:val="Heading1"/>
       </w:pPr>
-      <w:bookmarkStart w:id="10" w:name="_Toc243733102"/>
+      <w:bookmarkStart w:id="10" w:name="_Toc243758698"/>
       <w:r>
         <w:lastRenderedPageBreak/>
         <w:t>7. Step-by-Step Analytical Strategy</w:t>
@@ -6186,7 +6171,7 @@
       <w:pPr>
         <w:pStyle w:val="Heading2"/>
       </w:pPr>
-      <w:bookmarkStart w:id="11" w:name="_Toc243733103"/>
+      <w:bookmarkStart w:id="11" w:name="_Toc243758699"/>
       <w:r>
         <w:t>7.1 Data acquisition</w:t>
       </w:r>
@@ -6242,7 +6227,7 @@
       <w:pPr>
         <w:pStyle w:val="Heading2"/>
       </w:pPr>
-      <w:bookmarkStart w:id="12" w:name="_Toc243733104"/>
+      <w:bookmarkStart w:id="12" w:name="_Toc243758700"/>
       <w:r>
         <w:t>7.2 Data profiling and cleaning</w:t>
       </w:r>
@@ -6306,7 +6291,7 @@
       <w:pPr>
         <w:pStyle w:val="Heading2"/>
       </w:pPr>
-      <w:bookmarkStart w:id="13" w:name="_Toc243733105"/>
+      <w:bookmarkStart w:id="13" w:name="_Toc243758701"/>
       <w:r>
         <w:t>7.3 Exploratory analysis</w:t>
       </w:r>
@@ -6362,7 +6347,7 @@
       <w:pPr>
         <w:pStyle w:val="Heading2"/>
       </w:pPr>
-      <w:bookmarkStart w:id="14" w:name="_Toc243733106"/>
+      <w:bookmarkStart w:id="14" w:name="_Toc243758702"/>
       <w:r>
         <w:t>7.4 Statistical analysis</w:t>
       </w:r>
@@ -6418,7 +6403,7 @@
       <w:pPr>
         <w:pStyle w:val="Heading2"/>
       </w:pPr>
-      <w:bookmarkStart w:id="15" w:name="_Toc243733107"/>
+      <w:bookmarkStart w:id="15" w:name="_Toc243758703"/>
       <w:r>
         <w:t>7.5 Predictive modelling</w:t>
       </w:r>
@@ -6482,7 +6467,7 @@
       <w:pPr>
         <w:pStyle w:val="Heading2"/>
       </w:pPr>
-      <w:bookmarkStart w:id="16" w:name="_Toc243733108"/>
+      <w:bookmarkStart w:id="16" w:name="_Toc243758704"/>
       <w:r>
         <w:t>7.6 Visualisation and reporting</w:t>
       </w:r>
@@ -6531,7 +6516,7 @@
       <w:pPr>
         <w:pStyle w:val="Heading2"/>
       </w:pPr>
-      <w:bookmarkStart w:id="17" w:name="_Toc243733109"/>
+      <w:bookmarkStart w:id="17" w:name="_Toc243758705"/>
       <w:r>
         <w:t>7.7 Tools and resources</w:t>
       </w:r>
@@ -6953,7 +6938,7 @@
       <w:pPr>
         <w:pStyle w:val="Heading1"/>
       </w:pPr>
-      <w:bookmarkStart w:id="18" w:name="_Toc243733110"/>
+      <w:bookmarkStart w:id="18" w:name="_Toc243758706"/>
       <w:r>
         <w:lastRenderedPageBreak/>
         <w:t>8. Key Metrics (KPI Catalogue)</w:t>
@@ -8114,7 +8099,7 @@
       <w:pPr>
         <w:pStyle w:val="Heading1"/>
       </w:pPr>
-      <w:bookmarkStart w:id="19" w:name="_Toc243733111"/>
+      <w:bookmarkStart w:id="19" w:name="_Toc243758707"/>
       <w:r>
         <w:lastRenderedPageBreak/>
         <w:t>9. Deliverables</w:t>
@@ -8699,7 +8684,7 @@
       <w:pPr>
         <w:pStyle w:val="Heading1"/>
       </w:pPr>
-      <w:bookmarkStart w:id="20" w:name="_Toc243733112"/>
+      <w:bookmarkStart w:id="20" w:name="_Toc243758708"/>
       <w:r>
         <w:lastRenderedPageBreak/>
         <w:t>10. Roadmap and Timeline</w:t>
@@ -8716,7 +8701,7 @@
           <w:noProof/>
         </w:rPr>
         <w:drawing>
-          <wp:inline distT="0" distB="0" distL="0" distR="0" wp14:anchorId="5FE50A39" wp14:editId="70C60904">
+          <wp:inline distT="0" distB="0" distL="0" distR="0" wp14:anchorId="77AFF19C" wp14:editId="33D4DF44">
             <wp:extent cx="5903999" cy="2855045"/>
             <wp:effectExtent l="0" t="0" r="0" b="0"/>
             <wp:docPr id="2" name="Picture 2"/>
@@ -9606,7 +9591,7 @@
       <w:pPr>
         <w:pStyle w:val="Heading2"/>
       </w:pPr>
-      <w:bookmarkStart w:id="21" w:name="_Toc243733113"/>
+      <w:bookmarkStart w:id="21" w:name="_Toc243758709"/>
       <w:r>
         <w:t>10.1 Milestone definitions</w:t>
       </w:r>
@@ -10071,7 +10056,7 @@
       <w:pPr>
         <w:pStyle w:val="Heading1"/>
       </w:pPr>
-      <w:bookmarkStart w:id="22" w:name="_Toc243733114"/>
+      <w:bookmarkStart w:id="22" w:name="_Toc243758710"/>
       <w:r>
         <w:lastRenderedPageBreak/>
         <w:t>11. Resource Allocation</w:t>
@@ -10882,7 +10867,7 @@
       <w:pPr>
         <w:pStyle w:val="Heading1"/>
       </w:pPr>
-      <w:bookmarkStart w:id="23" w:name="_Toc243733115"/>
+      <w:bookmarkStart w:id="23" w:name="_Toc243758711"/>
       <w:r>
         <w:lastRenderedPageBreak/>
         <w:t>12. Risk Management and Contingency Planning</w:t>
@@ -10907,7 +10892,7 @@
           <w:noProof/>
         </w:rPr>
         <w:drawing>
-          <wp:inline distT="0" distB="0" distL="0" distR="0" wp14:anchorId="7854D643" wp14:editId="69ACB343">
+          <wp:inline distT="0" distB="0" distL="0" distR="0" wp14:anchorId="0885F545" wp14:editId="161F0913">
             <wp:extent cx="3780000" cy="3291628"/>
             <wp:effectExtent l="0" t="0" r="0" b="0"/>
             <wp:docPr id="3" name="Picture 3"/>
@@ -12705,7 +12690,7 @@
       <w:pPr>
         <w:pStyle w:val="Heading2"/>
       </w:pPr>
-      <w:bookmarkStart w:id="24" w:name="_Toc243733116"/>
+      <w:bookmarkStart w:id="24" w:name="_Toc243758712"/>
       <w:r>
         <w:lastRenderedPageBreak/>
         <w:t>12.1 Contingency triggers</w:t>
@@ -12753,7 +12738,7 @@
       <w:pPr>
         <w:pStyle w:val="Heading1"/>
       </w:pPr>
-      <w:bookmarkStart w:id="25" w:name="_Toc243733117"/>
+      <w:bookmarkStart w:id="25" w:name="_Toc243758713"/>
       <w:r>
         <w:lastRenderedPageBreak/>
         <w:t>13. Communication Plan</w:t>
@@ -13265,7 +13250,7 @@
       <w:pPr>
         <w:pStyle w:val="Heading1"/>
       </w:pPr>
-      <w:bookmarkStart w:id="26" w:name="_Toc243733118"/>
+      <w:bookmarkStart w:id="26" w:name="_Toc243758714"/>
       <w:r>
         <w:lastRenderedPageBreak/>
         <w:t>14. Quality and Success Criteria</w:t>
@@ -13316,7 +13301,7 @@
       <w:pPr>
         <w:pStyle w:val="Heading1"/>
       </w:pPr>
-      <w:bookmarkStart w:id="27" w:name="_Toc243733119"/>
+      <w:bookmarkStart w:id="27" w:name="_Toc243758715"/>
       <w:r>
         <w:t>15. Conclusion</w:t>
       </w:r>
@@ -13339,7 +13324,7 @@
       <w:pPr>
         <w:pStyle w:val="Heading1"/>
       </w:pPr>
-      <w:bookmarkStart w:id="28" w:name="_Toc243733120"/>
+      <w:bookmarkStart w:id="28" w:name="_Toc243758716"/>
       <w:r>
         <w:lastRenderedPageBreak/>
         <w:t>References</w:t>
@@ -13848,31 +13833,31 @@
       </w:rPr>
     </w:lvl>
   </w:abstractNum>
-  <w:num w:numId="1" w16cid:durableId="1325165801">
+  <w:num w:numId="1" w16cid:durableId="131101042">
     <w:abstractNumId w:val="8"/>
   </w:num>
-  <w:num w:numId="2" w16cid:durableId="614366572">
+  <w:num w:numId="2" w16cid:durableId="1277564894">
     <w:abstractNumId w:val="6"/>
   </w:num>
-  <w:num w:numId="3" w16cid:durableId="738751573">
+  <w:num w:numId="3" w16cid:durableId="1039668795">
     <w:abstractNumId w:val="5"/>
   </w:num>
-  <w:num w:numId="4" w16cid:durableId="1461411961">
+  <w:num w:numId="4" w16cid:durableId="1446071521">
     <w:abstractNumId w:val="4"/>
   </w:num>
-  <w:num w:numId="5" w16cid:durableId="847715383">
+  <w:num w:numId="5" w16cid:durableId="1288664900">
     <w:abstractNumId w:val="7"/>
   </w:num>
-  <w:num w:numId="6" w16cid:durableId="1301232040">
+  <w:num w:numId="6" w16cid:durableId="1926915305">
     <w:abstractNumId w:val="3"/>
   </w:num>
-  <w:num w:numId="7" w16cid:durableId="653876611">
+  <w:num w:numId="7" w16cid:durableId="348414552">
     <w:abstractNumId w:val="2"/>
   </w:num>
-  <w:num w:numId="8" w16cid:durableId="668868477">
+  <w:num w:numId="8" w16cid:durableId="1861778010">
     <w:abstractNumId w:val="1"/>
   </w:num>
-  <w:num w:numId="9" w16cid:durableId="359865238">
+  <w:num w:numId="9" w16cid:durableId="1335375760">
     <w:abstractNumId w:val="0"/>
   </w:num>
 </w:numbering>
@@ -25262,7 +25247,7 @@
     <w:autoRedefine/>
     <w:uiPriority w:val="39"/>
     <w:unhideWhenUsed/>
-    <w:rsid w:val="005A0FDE"/>
+    <w:rsid w:val="002C55FE"/>
     <w:pPr>
       <w:spacing w:after="100"/>
     </w:pPr>
@@ -25274,7 +25259,7 @@
     <w:autoRedefine/>
     <w:uiPriority w:val="39"/>
     <w:unhideWhenUsed/>
-    <w:rsid w:val="005A0FDE"/>
+    <w:rsid w:val="002C55FE"/>
     <w:pPr>
       <w:spacing w:after="100"/>
       <w:ind w:left="210"/>
@@ -25285,7 +25270,7 @@
     <w:basedOn w:val="DefaultParagraphFont"/>
     <w:uiPriority w:val="99"/>
     <w:unhideWhenUsed/>
-    <w:rsid w:val="005A0FDE"/>
+    <w:rsid w:val="002C55FE"/>
     <w:rPr>
       <w:color w:val="0000FF" w:themeColor="hyperlink"/>
       <w:u w:val="single"/>

</xml_diff>

<commit_message>
Refresh outputs and reports from a full pipeline run
Re-ran all nine steps in the project folder; results are identical.
Changes are regenerated files only (timestamps, float rounding and
Word field refresh of the contents pages).

Co-Authored-By: Claude Opus 5.5 <noreply@anthropic.com>
</commit_message>
<xml_diff>
--- a/report/weekly/Week1_Strategic_Plan.docx
+++ b/report/weekly/Week1_Strategic_Plan.docx
@@ -164,7 +164,7 @@
       <w:r>
         <w:fldChar w:fldCharType="separate"/>
       </w:r>
-      <w:hyperlink w:anchor="_Toc243758688" w:history="1">
+      <w:hyperlink w:anchor="_Toc243759657" w:history="1">
         <w:r>
           <w:rPr>
             <w:rStyle w:val="Hyperlink"/>
@@ -191,7 +191,7 @@
             <w:noProof/>
             <w:webHidden/>
           </w:rPr>
-          <w:instrText xml:space="preserve"> PAGEREF _Toc243758688 \h </w:instrText>
+          <w:instrText xml:space="preserve"> PAGEREF _Toc243759657 \h </w:instrText>
         </w:r>
         <w:r>
           <w:rPr>
@@ -239,7 +239,7 @@
           <w14:ligatures w14:val="standardContextual"/>
         </w:rPr>
       </w:pPr>
-      <w:hyperlink w:anchor="_Toc243758689" w:history="1">
+      <w:hyperlink w:anchor="_Toc243759658" w:history="1">
         <w:r>
           <w:rPr>
             <w:rStyle w:val="Hyperlink"/>
@@ -266,7 +266,7 @@
             <w:noProof/>
             <w:webHidden/>
           </w:rPr>
-          <w:instrText xml:space="preserve"> PAGEREF _Toc243758689 \h </w:instrText>
+          <w:instrText xml:space="preserve"> PAGEREF _Toc243759658 \h </w:instrText>
         </w:r>
         <w:r>
           <w:rPr>
@@ -314,7 +314,7 @@
           <w14:ligatures w14:val="standardContextual"/>
         </w:rPr>
       </w:pPr>
-      <w:hyperlink w:anchor="_Toc243758690" w:history="1">
+      <w:hyperlink w:anchor="_Toc243759659" w:history="1">
         <w:r>
           <w:rPr>
             <w:rStyle w:val="Hyperlink"/>
@@ -341,7 +341,7 @@
             <w:noProof/>
             <w:webHidden/>
           </w:rPr>
-          <w:instrText xml:space="preserve"> PAGEREF _Toc243758690 \h </w:instrText>
+          <w:instrText xml:space="preserve"> PAGEREF _Toc243759659 \h </w:instrText>
         </w:r>
         <w:r>
           <w:rPr>
@@ -389,7 +389,7 @@
           <w14:ligatures w14:val="standardContextual"/>
         </w:rPr>
       </w:pPr>
-      <w:hyperlink w:anchor="_Toc243758691" w:history="1">
+      <w:hyperlink w:anchor="_Toc243759660" w:history="1">
         <w:r>
           <w:rPr>
             <w:rStyle w:val="Hyperlink"/>
@@ -416,7 +416,7 @@
             <w:noProof/>
             <w:webHidden/>
           </w:rPr>
-          <w:instrText xml:space="preserve"> PAGEREF _Toc243758691 \h </w:instrText>
+          <w:instrText xml:space="preserve"> PAGEREF _Toc243759660 \h </w:instrText>
         </w:r>
         <w:r>
           <w:rPr>
@@ -464,7 +464,7 @@
           <w14:ligatures w14:val="standardContextual"/>
         </w:rPr>
       </w:pPr>
-      <w:hyperlink w:anchor="_Toc243758692" w:history="1">
+      <w:hyperlink w:anchor="_Toc243759661" w:history="1">
         <w:r>
           <w:rPr>
             <w:rStyle w:val="Hyperlink"/>
@@ -491,7 +491,7 @@
             <w:noProof/>
             <w:webHidden/>
           </w:rPr>
-          <w:instrText xml:space="preserve"> PAGEREF _Toc243758692 \h </w:instrText>
+          <w:instrText xml:space="preserve"> PAGEREF _Toc243759661 \h </w:instrText>
         </w:r>
         <w:r>
           <w:rPr>
@@ -539,7 +539,7 @@
           <w14:ligatures w14:val="standardContextual"/>
         </w:rPr>
       </w:pPr>
-      <w:hyperlink w:anchor="_Toc243758693" w:history="1">
+      <w:hyperlink w:anchor="_Toc243759662" w:history="1">
         <w:r>
           <w:rPr>
             <w:rStyle w:val="Hyperlink"/>
@@ -566,7 +566,7 @@
             <w:noProof/>
             <w:webHidden/>
           </w:rPr>
-          <w:instrText xml:space="preserve"> PAGEREF _Toc243758693 \h </w:instrText>
+          <w:instrText xml:space="preserve"> PAGEREF _Toc243759662 \h </w:instrText>
         </w:r>
         <w:r>
           <w:rPr>
@@ -614,7 +614,7 @@
           <w14:ligatures w14:val="standardContextual"/>
         </w:rPr>
       </w:pPr>
-      <w:hyperlink w:anchor="_Toc243758694" w:history="1">
+      <w:hyperlink w:anchor="_Toc243759663" w:history="1">
         <w:r>
           <w:rPr>
             <w:rStyle w:val="Hyperlink"/>
@@ -641,7 +641,7 @@
             <w:noProof/>
             <w:webHidden/>
           </w:rPr>
-          <w:instrText xml:space="preserve"> PAGEREF _Toc243758694 \h </w:instrText>
+          <w:instrText xml:space="preserve"> PAGEREF _Toc243759663 \h </w:instrText>
         </w:r>
         <w:r>
           <w:rPr>
@@ -689,7 +689,7 @@
           <w14:ligatures w14:val="standardContextual"/>
         </w:rPr>
       </w:pPr>
-      <w:hyperlink w:anchor="_Toc243758695" w:history="1">
+      <w:hyperlink w:anchor="_Toc243759664" w:history="1">
         <w:r>
           <w:rPr>
             <w:rStyle w:val="Hyperlink"/>
@@ -716,7 +716,7 @@
             <w:noProof/>
             <w:webHidden/>
           </w:rPr>
-          <w:instrText xml:space="preserve"> PAGEREF _Toc243758695 \h </w:instrText>
+          <w:instrText xml:space="preserve"> PAGEREF _Toc243759664 \h </w:instrText>
         </w:r>
         <w:r>
           <w:rPr>
@@ -764,7 +764,7 @@
           <w14:ligatures w14:val="standardContextual"/>
         </w:rPr>
       </w:pPr>
-      <w:hyperlink w:anchor="_Toc243758696" w:history="1">
+      <w:hyperlink w:anchor="_Toc243759665" w:history="1">
         <w:r>
           <w:rPr>
             <w:rStyle w:val="Hyperlink"/>
@@ -791,7 +791,7 @@
             <w:noProof/>
             <w:webHidden/>
           </w:rPr>
-          <w:instrText xml:space="preserve"> PAGEREF _Toc243758696 \h </w:instrText>
+          <w:instrText xml:space="preserve"> PAGEREF _Toc243759665 \h </w:instrText>
         </w:r>
         <w:r>
           <w:rPr>
@@ -839,7 +839,7 @@
           <w14:ligatures w14:val="standardContextual"/>
         </w:rPr>
       </w:pPr>
-      <w:hyperlink w:anchor="_Toc243758697" w:history="1">
+      <w:hyperlink w:anchor="_Toc243759666" w:history="1">
         <w:r>
           <w:rPr>
             <w:rStyle w:val="Hyperlink"/>
@@ -866,7 +866,7 @@
             <w:noProof/>
             <w:webHidden/>
           </w:rPr>
-          <w:instrText xml:space="preserve"> PAGEREF _Toc243758697 \h </w:instrText>
+          <w:instrText xml:space="preserve"> PAGEREF _Toc243759666 \h </w:instrText>
         </w:r>
         <w:r>
           <w:rPr>
@@ -914,7 +914,7 @@
           <w14:ligatures w14:val="standardContextual"/>
         </w:rPr>
       </w:pPr>
-      <w:hyperlink w:anchor="_Toc243758698" w:history="1">
+      <w:hyperlink w:anchor="_Toc243759667" w:history="1">
         <w:r>
           <w:rPr>
             <w:rStyle w:val="Hyperlink"/>
@@ -941,7 +941,7 @@
             <w:noProof/>
             <w:webHidden/>
           </w:rPr>
-          <w:instrText xml:space="preserve"> PAGEREF _Toc243758698 \h </w:instrText>
+          <w:instrText xml:space="preserve"> PAGEREF _Toc243759667 \h </w:instrText>
         </w:r>
         <w:r>
           <w:rPr>
@@ -989,7 +989,7 @@
           <w14:ligatures w14:val="standardContextual"/>
         </w:rPr>
       </w:pPr>
-      <w:hyperlink w:anchor="_Toc243758699" w:history="1">
+      <w:hyperlink w:anchor="_Toc243759668" w:history="1">
         <w:r>
           <w:rPr>
             <w:rStyle w:val="Hyperlink"/>
@@ -1016,7 +1016,7 @@
             <w:noProof/>
             <w:webHidden/>
           </w:rPr>
-          <w:instrText xml:space="preserve"> PAGEREF _Toc243758699 \h </w:instrText>
+          <w:instrText xml:space="preserve"> PAGEREF _Toc243759668 \h </w:instrText>
         </w:r>
         <w:r>
           <w:rPr>
@@ -1064,7 +1064,7 @@
           <w14:ligatures w14:val="standardContextual"/>
         </w:rPr>
       </w:pPr>
-      <w:hyperlink w:anchor="_Toc243758700" w:history="1">
+      <w:hyperlink w:anchor="_Toc243759669" w:history="1">
         <w:r>
           <w:rPr>
             <w:rStyle w:val="Hyperlink"/>
@@ -1091,7 +1091,7 @@
             <w:noProof/>
             <w:webHidden/>
           </w:rPr>
-          <w:instrText xml:space="preserve"> PAGEREF _Toc243758700 \h </w:instrText>
+          <w:instrText xml:space="preserve"> PAGEREF _Toc243759669 \h </w:instrText>
         </w:r>
         <w:r>
           <w:rPr>
@@ -1139,7 +1139,7 @@
           <w14:ligatures w14:val="standardContextual"/>
         </w:rPr>
       </w:pPr>
-      <w:hyperlink w:anchor="_Toc243758701" w:history="1">
+      <w:hyperlink w:anchor="_Toc243759670" w:history="1">
         <w:r>
           <w:rPr>
             <w:rStyle w:val="Hyperlink"/>
@@ -1166,7 +1166,7 @@
             <w:noProof/>
             <w:webHidden/>
           </w:rPr>
-          <w:instrText xml:space="preserve"> PAGEREF _Toc243758701 \h </w:instrText>
+          <w:instrText xml:space="preserve"> PAGEREF _Toc243759670 \h </w:instrText>
         </w:r>
         <w:r>
           <w:rPr>
@@ -1214,7 +1214,7 @@
           <w14:ligatures w14:val="standardContextual"/>
         </w:rPr>
       </w:pPr>
-      <w:hyperlink w:anchor="_Toc243758702" w:history="1">
+      <w:hyperlink w:anchor="_Toc243759671" w:history="1">
         <w:r>
           <w:rPr>
             <w:rStyle w:val="Hyperlink"/>
@@ -1241,7 +1241,7 @@
             <w:noProof/>
             <w:webHidden/>
           </w:rPr>
-          <w:instrText xml:space="preserve"> PAGEREF _Toc243758702 \h </w:instrText>
+          <w:instrText xml:space="preserve"> PAGEREF _Toc243759671 \h </w:instrText>
         </w:r>
         <w:r>
           <w:rPr>
@@ -1289,7 +1289,7 @@
           <w14:ligatures w14:val="standardContextual"/>
         </w:rPr>
       </w:pPr>
-      <w:hyperlink w:anchor="_Toc243758703" w:history="1">
+      <w:hyperlink w:anchor="_Toc243759672" w:history="1">
         <w:r>
           <w:rPr>
             <w:rStyle w:val="Hyperlink"/>
@@ -1316,7 +1316,7 @@
             <w:noProof/>
             <w:webHidden/>
           </w:rPr>
-          <w:instrText xml:space="preserve"> PAGEREF _Toc243758703 \h </w:instrText>
+          <w:instrText xml:space="preserve"> PAGEREF _Toc243759672 \h </w:instrText>
         </w:r>
         <w:r>
           <w:rPr>
@@ -1364,7 +1364,7 @@
           <w14:ligatures w14:val="standardContextual"/>
         </w:rPr>
       </w:pPr>
-      <w:hyperlink w:anchor="_Toc243758704" w:history="1">
+      <w:hyperlink w:anchor="_Toc243759673" w:history="1">
         <w:r>
           <w:rPr>
             <w:rStyle w:val="Hyperlink"/>
@@ -1391,7 +1391,7 @@
             <w:noProof/>
             <w:webHidden/>
           </w:rPr>
-          <w:instrText xml:space="preserve"> PAGEREF _Toc243758704 \h </w:instrText>
+          <w:instrText xml:space="preserve"> PAGEREF _Toc243759673 \h </w:instrText>
         </w:r>
         <w:r>
           <w:rPr>
@@ -1439,7 +1439,7 @@
           <w14:ligatures w14:val="standardContextual"/>
         </w:rPr>
       </w:pPr>
-      <w:hyperlink w:anchor="_Toc243758705" w:history="1">
+      <w:hyperlink w:anchor="_Toc243759674" w:history="1">
         <w:r>
           <w:rPr>
             <w:rStyle w:val="Hyperlink"/>
@@ -1466,7 +1466,7 @@
             <w:noProof/>
             <w:webHidden/>
           </w:rPr>
-          <w:instrText xml:space="preserve"> PAGEREF _Toc243758705 \h </w:instrText>
+          <w:instrText xml:space="preserve"> PAGEREF _Toc243759674 \h </w:instrText>
         </w:r>
         <w:r>
           <w:rPr>
@@ -1514,7 +1514,7 @@
           <w14:ligatures w14:val="standardContextual"/>
         </w:rPr>
       </w:pPr>
-      <w:hyperlink w:anchor="_Toc243758706" w:history="1">
+      <w:hyperlink w:anchor="_Toc243759675" w:history="1">
         <w:r>
           <w:rPr>
             <w:rStyle w:val="Hyperlink"/>
@@ -1541,7 +1541,7 @@
             <w:noProof/>
             <w:webHidden/>
           </w:rPr>
-          <w:instrText xml:space="preserve"> PAGEREF _Toc243758706 \h </w:instrText>
+          <w:instrText xml:space="preserve"> PAGEREF _Toc243759675 \h </w:instrText>
         </w:r>
         <w:r>
           <w:rPr>
@@ -1589,7 +1589,7 @@
           <w14:ligatures w14:val="standardContextual"/>
         </w:rPr>
       </w:pPr>
-      <w:hyperlink w:anchor="_Toc243758707" w:history="1">
+      <w:hyperlink w:anchor="_Toc243759676" w:history="1">
         <w:r>
           <w:rPr>
             <w:rStyle w:val="Hyperlink"/>
@@ -1616,7 +1616,7 @@
             <w:noProof/>
             <w:webHidden/>
           </w:rPr>
-          <w:instrText xml:space="preserve"> PAGEREF _Toc243758707 \h </w:instrText>
+          <w:instrText xml:space="preserve"> PAGEREF _Toc243759676 \h </w:instrText>
         </w:r>
         <w:r>
           <w:rPr>
@@ -1664,7 +1664,7 @@
           <w14:ligatures w14:val="standardContextual"/>
         </w:rPr>
       </w:pPr>
-      <w:hyperlink w:anchor="_Toc243758708" w:history="1">
+      <w:hyperlink w:anchor="_Toc243759677" w:history="1">
         <w:r>
           <w:rPr>
             <w:rStyle w:val="Hyperlink"/>
@@ -1691,7 +1691,7 @@
             <w:noProof/>
             <w:webHidden/>
           </w:rPr>
-          <w:instrText xml:space="preserve"> PAGEREF _Toc243758708 \h </w:instrText>
+          <w:instrText xml:space="preserve"> PAGEREF _Toc243759677 \h </w:instrText>
         </w:r>
         <w:r>
           <w:rPr>
@@ -1739,7 +1739,7 @@
           <w14:ligatures w14:val="standardContextual"/>
         </w:rPr>
       </w:pPr>
-      <w:hyperlink w:anchor="_Toc243758709" w:history="1">
+      <w:hyperlink w:anchor="_Toc243759678" w:history="1">
         <w:r>
           <w:rPr>
             <w:rStyle w:val="Hyperlink"/>
@@ -1766,7 +1766,7 @@
             <w:noProof/>
             <w:webHidden/>
           </w:rPr>
-          <w:instrText xml:space="preserve"> PAGEREF _Toc243758709 \h </w:instrText>
+          <w:instrText xml:space="preserve"> PAGEREF _Toc243759678 \h </w:instrText>
         </w:r>
         <w:r>
           <w:rPr>
@@ -1814,7 +1814,7 @@
           <w14:ligatures w14:val="standardContextual"/>
         </w:rPr>
       </w:pPr>
-      <w:hyperlink w:anchor="_Toc243758710" w:history="1">
+      <w:hyperlink w:anchor="_Toc243759679" w:history="1">
         <w:r>
           <w:rPr>
             <w:rStyle w:val="Hyperlink"/>
@@ -1841,7 +1841,7 @@
             <w:noProof/>
             <w:webHidden/>
           </w:rPr>
-          <w:instrText xml:space="preserve"> PAGEREF _Toc243758710 \h </w:instrText>
+          <w:instrText xml:space="preserve"> PAGEREF _Toc243759679 \h </w:instrText>
         </w:r>
         <w:r>
           <w:rPr>
@@ -1889,7 +1889,7 @@
           <w14:ligatures w14:val="standardContextual"/>
         </w:rPr>
       </w:pPr>
-      <w:hyperlink w:anchor="_Toc243758711" w:history="1">
+      <w:hyperlink w:anchor="_Toc243759680" w:history="1">
         <w:r>
           <w:rPr>
             <w:rStyle w:val="Hyperlink"/>
@@ -1916,7 +1916,7 @@
             <w:noProof/>
             <w:webHidden/>
           </w:rPr>
-          <w:instrText xml:space="preserve"> PAGEREF _Toc243758711 \h </w:instrText>
+          <w:instrText xml:space="preserve"> PAGEREF _Toc243759680 \h </w:instrText>
         </w:r>
         <w:r>
           <w:rPr>
@@ -1964,7 +1964,7 @@
           <w14:ligatures w14:val="standardContextual"/>
         </w:rPr>
       </w:pPr>
-      <w:hyperlink w:anchor="_Toc243758712" w:history="1">
+      <w:hyperlink w:anchor="_Toc243759681" w:history="1">
         <w:r>
           <w:rPr>
             <w:rStyle w:val="Hyperlink"/>
@@ -1991,7 +1991,7 @@
             <w:noProof/>
             <w:webHidden/>
           </w:rPr>
-          <w:instrText xml:space="preserve"> PAGEREF _Toc243758712 \h </w:instrText>
+          <w:instrText xml:space="preserve"> PAGEREF _Toc243759681 \h </w:instrText>
         </w:r>
         <w:r>
           <w:rPr>
@@ -2039,7 +2039,7 @@
           <w14:ligatures w14:val="standardContextual"/>
         </w:rPr>
       </w:pPr>
-      <w:hyperlink w:anchor="_Toc243758713" w:history="1">
+      <w:hyperlink w:anchor="_Toc243759682" w:history="1">
         <w:r>
           <w:rPr>
             <w:rStyle w:val="Hyperlink"/>
@@ -2066,7 +2066,7 @@
             <w:noProof/>
             <w:webHidden/>
           </w:rPr>
-          <w:instrText xml:space="preserve"> PAGEREF _Toc243758713 \h </w:instrText>
+          <w:instrText xml:space="preserve"> PAGEREF _Toc243759682 \h </w:instrText>
         </w:r>
         <w:r>
           <w:rPr>
@@ -2114,7 +2114,7 @@
           <w14:ligatures w14:val="standardContextual"/>
         </w:rPr>
       </w:pPr>
-      <w:hyperlink w:anchor="_Toc243758714" w:history="1">
+      <w:hyperlink w:anchor="_Toc243759683" w:history="1">
         <w:r>
           <w:rPr>
             <w:rStyle w:val="Hyperlink"/>
@@ -2141,7 +2141,7 @@
             <w:noProof/>
             <w:webHidden/>
           </w:rPr>
-          <w:instrText xml:space="preserve"> PAGEREF _Toc243758714 \h </w:instrText>
+          <w:instrText xml:space="preserve"> PAGEREF _Toc243759683 \h </w:instrText>
         </w:r>
         <w:r>
           <w:rPr>
@@ -2189,7 +2189,7 @@
           <w14:ligatures w14:val="standardContextual"/>
         </w:rPr>
       </w:pPr>
-      <w:hyperlink w:anchor="_Toc243758715" w:history="1">
+      <w:hyperlink w:anchor="_Toc243759684" w:history="1">
         <w:r>
           <w:rPr>
             <w:rStyle w:val="Hyperlink"/>
@@ -2216,7 +2216,7 @@
             <w:noProof/>
             <w:webHidden/>
           </w:rPr>
-          <w:instrText xml:space="preserve"> PAGEREF _Toc243758715 \h </w:instrText>
+          <w:instrText xml:space="preserve"> PAGEREF _Toc243759684 \h </w:instrText>
         </w:r>
         <w:r>
           <w:rPr>
@@ -2264,7 +2264,7 @@
           <w14:ligatures w14:val="standardContextual"/>
         </w:rPr>
       </w:pPr>
-      <w:hyperlink w:anchor="_Toc243758716" w:history="1">
+      <w:hyperlink w:anchor="_Toc243759685" w:history="1">
         <w:r>
           <w:rPr>
             <w:rStyle w:val="Hyperlink"/>
@@ -2291,7 +2291,7 @@
             <w:noProof/>
             <w:webHidden/>
           </w:rPr>
-          <w:instrText xml:space="preserve"> PAGEREF _Toc243758716 \h </w:instrText>
+          <w:instrText xml:space="preserve"> PAGEREF _Toc243759685 \h </w:instrText>
         </w:r>
         <w:r>
           <w:rPr>
@@ -2350,7 +2350,7 @@
       <w:pPr>
         <w:pStyle w:val="Heading1"/>
       </w:pPr>
-      <w:bookmarkStart w:id="0" w:name="_Toc243758688"/>
+      <w:bookmarkStart w:id="0" w:name="_Toc243759657"/>
       <w:r>
         <w:t>1. Executive Summary</w:t>
       </w:r>
@@ -2473,7 +2473,7 @@
       <w:pPr>
         <w:pStyle w:val="Heading1"/>
       </w:pPr>
-      <w:bookmarkStart w:id="1" w:name="_Toc243758689"/>
+      <w:bookmarkStart w:id="1" w:name="_Toc243759658"/>
       <w:r>
         <w:lastRenderedPageBreak/>
         <w:t>2. The Role of Strategic Planning in Healthcare Data Analysis</w:t>
@@ -2565,7 +2565,7 @@
           <w:noProof/>
         </w:rPr>
         <w:drawing>
-          <wp:inline distT="0" distB="0" distL="0" distR="0" wp14:anchorId="6CE8D044" wp14:editId="3A8ABE36">
+          <wp:inline distT="0" distB="0" distL="0" distR="0" wp14:anchorId="045482AD" wp14:editId="3925CF03">
             <wp:extent cx="5903999" cy="1862677"/>
             <wp:effectExtent l="0" t="0" r="0" b="0"/>
             <wp:docPr id="1" name="Picture 1"/>
@@ -2653,7 +2653,7 @@
       <w:pPr>
         <w:pStyle w:val="Heading1"/>
       </w:pPr>
-      <w:bookmarkStart w:id="2" w:name="_Toc243758690"/>
+      <w:bookmarkStart w:id="2" w:name="_Toc243759659"/>
       <w:r>
         <w:lastRenderedPageBreak/>
         <w:t>3. Problem Statement and Business Case</w:t>
@@ -2969,7 +2969,7 @@
       <w:pPr>
         <w:pStyle w:val="Heading1"/>
       </w:pPr>
-      <w:bookmarkStart w:id="3" w:name="_Toc243758691"/>
+      <w:bookmarkStart w:id="3" w:name="_Toc243759660"/>
       <w:r>
         <w:lastRenderedPageBreak/>
         <w:t>4. Project Scope</w:t>
@@ -3272,7 +3272,7 @@
       <w:pPr>
         <w:pStyle w:val="Heading2"/>
       </w:pPr>
-      <w:bookmarkStart w:id="4" w:name="_Toc243758692"/>
+      <w:bookmarkStart w:id="4" w:name="_Toc243759661"/>
       <w:r>
         <w:t>4.1 Objectives (SMART)</w:t>
       </w:r>
@@ -3920,7 +3920,7 @@
       <w:pPr>
         <w:pStyle w:val="Heading2"/>
       </w:pPr>
-      <w:bookmarkStart w:id="5" w:name="_Toc243758693"/>
+      <w:bookmarkStart w:id="5" w:name="_Toc243759662"/>
       <w:r>
         <w:t>4.2 Key questions and hypotheses</w:t>
       </w:r>
@@ -4438,7 +4438,7 @@
       <w:pPr>
         <w:pStyle w:val="Heading1"/>
       </w:pPr>
-      <w:bookmarkStart w:id="6" w:name="_Toc243758694"/>
+      <w:bookmarkStart w:id="6" w:name="_Toc243759663"/>
       <w:r>
         <w:lastRenderedPageBreak/>
         <w:t>5. Stakeholders and Governance</w:t>
@@ -5160,7 +5160,7 @@
       <w:pPr>
         <w:pStyle w:val="Heading2"/>
       </w:pPr>
-      <w:bookmarkStart w:id="7" w:name="_Toc243758695"/>
+      <w:bookmarkStart w:id="7" w:name="_Toc243759664"/>
       <w:r>
         <w:t>5.1 Responsibilities (RACI)</w:t>
       </w:r>
@@ -6078,7 +6078,7 @@
       <w:pPr>
         <w:pStyle w:val="Heading2"/>
       </w:pPr>
-      <w:bookmarkStart w:id="8" w:name="_Toc243758696"/>
+      <w:bookmarkStart w:id="8" w:name="_Toc243759665"/>
       <w:r>
         <w:t>5.2 Governance procedures</w:t>
       </w:r>
@@ -6133,7 +6133,7 @@
       <w:pPr>
         <w:pStyle w:val="Heading1"/>
       </w:pPr>
-      <w:bookmarkStart w:id="9" w:name="_Toc243758697"/>
+      <w:bookmarkStart w:id="9" w:name="_Toc243759666"/>
       <w:r>
         <w:lastRenderedPageBreak/>
         <w:t>6. Data Strategy</w:t>
@@ -6160,7 +6160,7 @@
       <w:pPr>
         <w:pStyle w:val="Heading1"/>
       </w:pPr>
-      <w:bookmarkStart w:id="10" w:name="_Toc243758698"/>
+      <w:bookmarkStart w:id="10" w:name="_Toc243759667"/>
       <w:r>
         <w:lastRenderedPageBreak/>
         <w:t>7. Step-by-Step Analytical Strategy</w:t>
@@ -6171,7 +6171,7 @@
       <w:pPr>
         <w:pStyle w:val="Heading2"/>
       </w:pPr>
-      <w:bookmarkStart w:id="11" w:name="_Toc243758699"/>
+      <w:bookmarkStart w:id="11" w:name="_Toc243759668"/>
       <w:r>
         <w:t>7.1 Data acquisition</w:t>
       </w:r>
@@ -6227,7 +6227,7 @@
       <w:pPr>
         <w:pStyle w:val="Heading2"/>
       </w:pPr>
-      <w:bookmarkStart w:id="12" w:name="_Toc243758700"/>
+      <w:bookmarkStart w:id="12" w:name="_Toc243759669"/>
       <w:r>
         <w:t>7.2 Data profiling and cleaning</w:t>
       </w:r>
@@ -6291,7 +6291,7 @@
       <w:pPr>
         <w:pStyle w:val="Heading2"/>
       </w:pPr>
-      <w:bookmarkStart w:id="13" w:name="_Toc243758701"/>
+      <w:bookmarkStart w:id="13" w:name="_Toc243759670"/>
       <w:r>
         <w:t>7.3 Exploratory analysis</w:t>
       </w:r>
@@ -6347,7 +6347,7 @@
       <w:pPr>
         <w:pStyle w:val="Heading2"/>
       </w:pPr>
-      <w:bookmarkStart w:id="14" w:name="_Toc243758702"/>
+      <w:bookmarkStart w:id="14" w:name="_Toc243759671"/>
       <w:r>
         <w:t>7.4 Statistical analysis</w:t>
       </w:r>
@@ -6403,7 +6403,7 @@
       <w:pPr>
         <w:pStyle w:val="Heading2"/>
       </w:pPr>
-      <w:bookmarkStart w:id="15" w:name="_Toc243758703"/>
+      <w:bookmarkStart w:id="15" w:name="_Toc243759672"/>
       <w:r>
         <w:t>7.5 Predictive modelling</w:t>
       </w:r>
@@ -6467,7 +6467,7 @@
       <w:pPr>
         <w:pStyle w:val="Heading2"/>
       </w:pPr>
-      <w:bookmarkStart w:id="16" w:name="_Toc243758704"/>
+      <w:bookmarkStart w:id="16" w:name="_Toc243759673"/>
       <w:r>
         <w:t>7.6 Visualisation and reporting</w:t>
       </w:r>
@@ -6516,7 +6516,7 @@
       <w:pPr>
         <w:pStyle w:val="Heading2"/>
       </w:pPr>
-      <w:bookmarkStart w:id="17" w:name="_Toc243758705"/>
+      <w:bookmarkStart w:id="17" w:name="_Toc243759674"/>
       <w:r>
         <w:t>7.7 Tools and resources</w:t>
       </w:r>
@@ -6938,7 +6938,7 @@
       <w:pPr>
         <w:pStyle w:val="Heading1"/>
       </w:pPr>
-      <w:bookmarkStart w:id="18" w:name="_Toc243758706"/>
+      <w:bookmarkStart w:id="18" w:name="_Toc243759675"/>
       <w:r>
         <w:lastRenderedPageBreak/>
         <w:t>8. Key Metrics (KPI Catalogue)</w:t>
@@ -8099,7 +8099,7 @@
       <w:pPr>
         <w:pStyle w:val="Heading1"/>
       </w:pPr>
-      <w:bookmarkStart w:id="19" w:name="_Toc243758707"/>
+      <w:bookmarkStart w:id="19" w:name="_Toc243759676"/>
       <w:r>
         <w:lastRenderedPageBreak/>
         <w:t>9. Deliverables</w:t>
@@ -8684,7 +8684,7 @@
       <w:pPr>
         <w:pStyle w:val="Heading1"/>
       </w:pPr>
-      <w:bookmarkStart w:id="20" w:name="_Toc243758708"/>
+      <w:bookmarkStart w:id="20" w:name="_Toc243759677"/>
       <w:r>
         <w:lastRenderedPageBreak/>
         <w:t>10. Roadmap and Timeline</w:t>
@@ -8701,7 +8701,7 @@
           <w:noProof/>
         </w:rPr>
         <w:drawing>
-          <wp:inline distT="0" distB="0" distL="0" distR="0" wp14:anchorId="77AFF19C" wp14:editId="33D4DF44">
+          <wp:inline distT="0" distB="0" distL="0" distR="0" wp14:anchorId="7A836759" wp14:editId="1E20C98E">
             <wp:extent cx="5903999" cy="2855045"/>
             <wp:effectExtent l="0" t="0" r="0" b="0"/>
             <wp:docPr id="2" name="Picture 2"/>
@@ -9591,7 +9591,7 @@
       <w:pPr>
         <w:pStyle w:val="Heading2"/>
       </w:pPr>
-      <w:bookmarkStart w:id="21" w:name="_Toc243758709"/>
+      <w:bookmarkStart w:id="21" w:name="_Toc243759678"/>
       <w:r>
         <w:t>10.1 Milestone definitions</w:t>
       </w:r>
@@ -10056,7 +10056,7 @@
       <w:pPr>
         <w:pStyle w:val="Heading1"/>
       </w:pPr>
-      <w:bookmarkStart w:id="22" w:name="_Toc243758710"/>
+      <w:bookmarkStart w:id="22" w:name="_Toc243759679"/>
       <w:r>
         <w:lastRenderedPageBreak/>
         <w:t>11. Resource Allocation</w:t>
@@ -10867,7 +10867,7 @@
       <w:pPr>
         <w:pStyle w:val="Heading1"/>
       </w:pPr>
-      <w:bookmarkStart w:id="23" w:name="_Toc243758711"/>
+      <w:bookmarkStart w:id="23" w:name="_Toc243759680"/>
       <w:r>
         <w:lastRenderedPageBreak/>
         <w:t>12. Risk Management and Contingency Planning</w:t>
@@ -10892,7 +10892,7 @@
           <w:noProof/>
         </w:rPr>
         <w:drawing>
-          <wp:inline distT="0" distB="0" distL="0" distR="0" wp14:anchorId="0885F545" wp14:editId="161F0913">
+          <wp:inline distT="0" distB="0" distL="0" distR="0" wp14:anchorId="6AE108C0" wp14:editId="5619A87B">
             <wp:extent cx="3780000" cy="3291628"/>
             <wp:effectExtent l="0" t="0" r="0" b="0"/>
             <wp:docPr id="3" name="Picture 3"/>
@@ -12690,7 +12690,7 @@
       <w:pPr>
         <w:pStyle w:val="Heading2"/>
       </w:pPr>
-      <w:bookmarkStart w:id="24" w:name="_Toc243758712"/>
+      <w:bookmarkStart w:id="24" w:name="_Toc243759681"/>
       <w:r>
         <w:lastRenderedPageBreak/>
         <w:t>12.1 Contingency triggers</w:t>
@@ -12738,7 +12738,7 @@
       <w:pPr>
         <w:pStyle w:val="Heading1"/>
       </w:pPr>
-      <w:bookmarkStart w:id="25" w:name="_Toc243758713"/>
+      <w:bookmarkStart w:id="25" w:name="_Toc243759682"/>
       <w:r>
         <w:lastRenderedPageBreak/>
         <w:t>13. Communication Plan</w:t>
@@ -13250,7 +13250,7 @@
       <w:pPr>
         <w:pStyle w:val="Heading1"/>
       </w:pPr>
-      <w:bookmarkStart w:id="26" w:name="_Toc243758714"/>
+      <w:bookmarkStart w:id="26" w:name="_Toc243759683"/>
       <w:r>
         <w:lastRenderedPageBreak/>
         <w:t>14. Quality and Success Criteria</w:t>
@@ -13301,7 +13301,7 @@
       <w:pPr>
         <w:pStyle w:val="Heading1"/>
       </w:pPr>
-      <w:bookmarkStart w:id="27" w:name="_Toc243758715"/>
+      <w:bookmarkStart w:id="27" w:name="_Toc243759684"/>
       <w:r>
         <w:t>15. Conclusion</w:t>
       </w:r>
@@ -13324,7 +13324,7 @@
       <w:pPr>
         <w:pStyle w:val="Heading1"/>
       </w:pPr>
-      <w:bookmarkStart w:id="28" w:name="_Toc243758716"/>
+      <w:bookmarkStart w:id="28" w:name="_Toc243759685"/>
       <w:r>
         <w:lastRenderedPageBreak/>
         <w:t>References</w:t>
@@ -13833,31 +13833,31 @@
       </w:rPr>
     </w:lvl>
   </w:abstractNum>
-  <w:num w:numId="1" w16cid:durableId="131101042">
+  <w:num w:numId="1" w16cid:durableId="481776225">
     <w:abstractNumId w:val="8"/>
   </w:num>
-  <w:num w:numId="2" w16cid:durableId="1277564894">
+  <w:num w:numId="2" w16cid:durableId="1623152192">
     <w:abstractNumId w:val="6"/>
   </w:num>
-  <w:num w:numId="3" w16cid:durableId="1039668795">
+  <w:num w:numId="3" w16cid:durableId="539367387">
     <w:abstractNumId w:val="5"/>
   </w:num>
-  <w:num w:numId="4" w16cid:durableId="1446071521">
+  <w:num w:numId="4" w16cid:durableId="2143182698">
     <w:abstractNumId w:val="4"/>
   </w:num>
-  <w:num w:numId="5" w16cid:durableId="1288664900">
+  <w:num w:numId="5" w16cid:durableId="1152478793">
     <w:abstractNumId w:val="7"/>
   </w:num>
-  <w:num w:numId="6" w16cid:durableId="1926915305">
+  <w:num w:numId="6" w16cid:durableId="585503636">
     <w:abstractNumId w:val="3"/>
   </w:num>
-  <w:num w:numId="7" w16cid:durableId="348414552">
+  <w:num w:numId="7" w16cid:durableId="1780569140">
     <w:abstractNumId w:val="2"/>
   </w:num>
-  <w:num w:numId="8" w16cid:durableId="1861778010">
+  <w:num w:numId="8" w16cid:durableId="1286159749">
     <w:abstractNumId w:val="1"/>
   </w:num>
-  <w:num w:numId="9" w16cid:durableId="1335375760">
+  <w:num w:numId="9" w16cid:durableId="1045568215">
     <w:abstractNumId w:val="0"/>
   </w:num>
 </w:numbering>
@@ -25247,7 +25247,7 @@
     <w:autoRedefine/>
     <w:uiPriority w:val="39"/>
     <w:unhideWhenUsed/>
-    <w:rsid w:val="002C55FE"/>
+    <w:rsid w:val="007F7EC5"/>
     <w:pPr>
       <w:spacing w:after="100"/>
     </w:pPr>
@@ -25259,7 +25259,7 @@
     <w:autoRedefine/>
     <w:uiPriority w:val="39"/>
     <w:unhideWhenUsed/>
-    <w:rsid w:val="002C55FE"/>
+    <w:rsid w:val="007F7EC5"/>
     <w:pPr>
       <w:spacing w:after="100"/>
       <w:ind w:left="210"/>
@@ -25270,7 +25270,7 @@
     <w:basedOn w:val="DefaultParagraphFont"/>
     <w:uiPriority w:val="99"/>
     <w:unhideWhenUsed/>
-    <w:rsid w:val="002C55FE"/>
+    <w:rsid w:val="007F7EC5"/>
     <w:rPr>
       <w:color w:val="0000FF" w:themeColor="hyperlink"/>
       <w:u w:val="single"/>

</xml_diff>